<commit_message>
UI + Pricing Improvements
- Added tipping system (No Tip / 10%)
- Display subtotal, tip, and total
- Implemented start screen (Start Order + Today's Special)
- Integrated call staff feature
- Updated requirements document with status column
</commit_message>
<xml_diff>
--- a/docs/Requirement specification.docx
+++ b/docs/Requirement specification.docx
@@ -31,9 +31,10 @@
       </w:tblPr>
       <w:tblGrid>
         <w:gridCol w:w="1559"/>
-        <w:gridCol w:w="3031"/>
-        <w:gridCol w:w="1267"/>
-        <w:gridCol w:w="3159"/>
+        <w:gridCol w:w="2276"/>
+        <w:gridCol w:w="1149"/>
+        <w:gridCol w:w="2335"/>
+        <w:gridCol w:w="1697"/>
       </w:tblGrid>
       <w:tr>
         <w:tc>
@@ -60,7 +61,7 @@
         </w:tc>
         <w:tc>
           <w:tcPr>
-            <w:tcW w:w="3031" w:type="dxa"/>
+            <w:tcW w:w="2276" w:type="dxa"/>
           </w:tcPr>
           <w:p>
             <w:pPr>
@@ -82,7 +83,7 @@
         </w:tc>
         <w:tc>
           <w:tcPr>
-            <w:tcW w:w="1267" w:type="dxa"/>
+            <w:tcW w:w="1149" w:type="dxa"/>
           </w:tcPr>
           <w:p>
             <w:pPr>
@@ -104,7 +105,7 @@
         </w:tc>
         <w:tc>
           <w:tcPr>
-            <w:tcW w:w="3159" w:type="dxa"/>
+            <w:tcW w:w="2335" w:type="dxa"/>
           </w:tcPr>
           <w:p>
             <w:pPr>
@@ -124,6 +125,28 @@
             </w:r>
           </w:p>
         </w:tc>
+        <w:tc>
+          <w:tcPr>
+            <w:tcW w:w="1697" w:type="dxa"/>
+          </w:tcPr>
+          <w:p>
+            <w:pPr>
+              <w:rPr>
+                <w:rFonts w:ascii="Times New Roman" w:hAnsi="Times New Roman" w:cs="Times New Roman"/>
+                <w:b/>
+                <w:bCs/>
+              </w:rPr>
+            </w:pPr>
+            <w:r>
+              <w:rPr>
+                <w:rFonts w:ascii="Times New Roman" w:hAnsi="Times New Roman" w:cs="Times New Roman"/>
+                <w:b/>
+                <w:bCs/>
+              </w:rPr>
+              <w:t>Status</w:t>
+            </w:r>
+          </w:p>
+        </w:tc>
       </w:tr>
       <w:tr>
         <w:tc>
@@ -146,7 +169,7 @@
         </w:tc>
         <w:tc>
           <w:tcPr>
-            <w:tcW w:w="3031" w:type="dxa"/>
+            <w:tcW w:w="2276" w:type="dxa"/>
           </w:tcPr>
           <w:p>
             <w:pPr>
@@ -164,19 +187,13 @@
               <w:rPr>
                 <w:rFonts w:ascii="Times New Roman" w:hAnsi="Times New Roman" w:cs="Times New Roman"/>
               </w:rPr>
-              <w:t>: starters, light course</w:t>
-            </w:r>
-            <w:r>
-              <w:rPr>
-                <w:rFonts w:ascii="Times New Roman" w:hAnsi="Times New Roman" w:cs="Times New Roman"/>
-              </w:rPr>
-              <w:t>s, desserts, beverages</w:t>
-            </w:r>
-          </w:p>
-        </w:tc>
-        <w:tc>
-          <w:tcPr>
-            <w:tcW w:w="1267" w:type="dxa"/>
+              <w:t>: starters, light courses, desserts, beverages</w:t>
+            </w:r>
+          </w:p>
+        </w:tc>
+        <w:tc>
+          <w:tcPr>
+            <w:tcW w:w="1149" w:type="dxa"/>
           </w:tcPr>
           <w:p>
             <w:pPr>
@@ -194,7 +211,7 @@
         </w:tc>
         <w:tc>
           <w:tcPr>
-            <w:tcW w:w="3159" w:type="dxa"/>
+            <w:tcW w:w="2335" w:type="dxa"/>
           </w:tcPr>
           <w:p>
             <w:pPr>
@@ -207,6 +224,24 @@
                 <w:rFonts w:ascii="Times New Roman" w:hAnsi="Times New Roman" w:cs="Times New Roman"/>
               </w:rPr>
               <w:t>Enables users to quickly locate items in a familiar menu structure.</w:t>
+            </w:r>
+          </w:p>
+        </w:tc>
+        <w:tc>
+          <w:tcPr>
+            <w:tcW w:w="1697" w:type="dxa"/>
+          </w:tcPr>
+          <w:p>
+            <w:pPr>
+              <w:rPr>
+                <w:rFonts w:ascii="Times New Roman" w:hAnsi="Times New Roman" w:cs="Times New Roman"/>
+              </w:rPr>
+            </w:pPr>
+            <w:r>
+              <w:rPr>
+                <w:rFonts w:ascii="Times New Roman" w:hAnsi="Times New Roman" w:cs="Times New Roman"/>
+              </w:rPr>
+              <w:t>Done</w:t>
             </w:r>
           </w:p>
         </w:tc>
@@ -232,7 +267,7 @@
         </w:tc>
         <w:tc>
           <w:tcPr>
-            <w:tcW w:w="3031" w:type="dxa"/>
+            <w:tcW w:w="2276" w:type="dxa"/>
           </w:tcPr>
           <w:p>
             <w:pPr>
@@ -250,37 +285,13 @@
               <w:rPr>
                 <w:rFonts w:ascii="Times New Roman" w:hAnsi="Times New Roman" w:cs="Times New Roman"/>
               </w:rPr>
-              <w:t>to</w:t>
-            </w:r>
-            <w:r>
-              <w:rPr>
-                <w:rFonts w:ascii="Times New Roman" w:hAnsi="Times New Roman" w:cs="Times New Roman"/>
-              </w:rPr>
-              <w:t xml:space="preserve"> the menu</w:t>
-            </w:r>
-            <w:r>
-              <w:rPr>
-                <w:rFonts w:ascii="Times New Roman" w:hAnsi="Times New Roman" w:cs="Times New Roman"/>
-              </w:rPr>
-              <w:t xml:space="preserve"> and</w:t>
-            </w:r>
-            <w:r>
-              <w:rPr>
-                <w:rFonts w:ascii="Times New Roman" w:hAnsi="Times New Roman" w:cs="Times New Roman"/>
-              </w:rPr>
-              <w:t xml:space="preserve"> </w:t>
-            </w:r>
-            <w:r>
-              <w:rPr>
-                <w:rFonts w:ascii="Times New Roman" w:hAnsi="Times New Roman" w:cs="Times New Roman"/>
-              </w:rPr>
-              <w:t>daily special meals</w:t>
-            </w:r>
-          </w:p>
-        </w:tc>
-        <w:tc>
-          <w:tcPr>
-            <w:tcW w:w="1267" w:type="dxa"/>
+              <w:t>to the menu and daily special meals</w:t>
+            </w:r>
+          </w:p>
+        </w:tc>
+        <w:tc>
+          <w:tcPr>
+            <w:tcW w:w="1149" w:type="dxa"/>
           </w:tcPr>
           <w:p>
             <w:pPr>
@@ -298,7 +309,7 @@
         </w:tc>
         <w:tc>
           <w:tcPr>
-            <w:tcW w:w="3159" w:type="dxa"/>
+            <w:tcW w:w="2335" w:type="dxa"/>
           </w:tcPr>
           <w:p>
             <w:pPr>
@@ -312,6 +323,18 @@
               </w:rPr>
               <w:t>Supports fast access for impatient users in a time-sensitive environment.</w:t>
             </w:r>
+          </w:p>
+        </w:tc>
+        <w:tc>
+          <w:tcPr>
+            <w:tcW w:w="1697" w:type="dxa"/>
+          </w:tcPr>
+          <w:p>
+            <w:pPr>
+              <w:rPr>
+                <w:rFonts w:ascii="Times New Roman" w:hAnsi="Times New Roman" w:cs="Times New Roman"/>
+              </w:rPr>
+            </w:pPr>
           </w:p>
         </w:tc>
       </w:tr>
@@ -336,7 +359,7 @@
         </w:tc>
         <w:tc>
           <w:tcPr>
-            <w:tcW w:w="3031" w:type="dxa"/>
+            <w:tcW w:w="2276" w:type="dxa"/>
           </w:tcPr>
           <w:p>
             <w:pPr>
@@ -354,7 +377,7 @@
         </w:tc>
         <w:tc>
           <w:tcPr>
-            <w:tcW w:w="1267" w:type="dxa"/>
+            <w:tcW w:w="1149" w:type="dxa"/>
           </w:tcPr>
           <w:p>
             <w:pPr>
@@ -372,7 +395,7 @@
         </w:tc>
         <w:tc>
           <w:tcPr>
-            <w:tcW w:w="3159" w:type="dxa"/>
+            <w:tcW w:w="2335" w:type="dxa"/>
           </w:tcPr>
           <w:p>
             <w:pPr>
@@ -386,6 +409,18 @@
               </w:rPr>
               <w:t>Supports group ordering behavior common in social settings.</w:t>
             </w:r>
+          </w:p>
+        </w:tc>
+        <w:tc>
+          <w:tcPr>
+            <w:tcW w:w="1697" w:type="dxa"/>
+          </w:tcPr>
+          <w:p>
+            <w:pPr>
+              <w:rPr>
+                <w:rFonts w:ascii="Times New Roman" w:hAnsi="Times New Roman" w:cs="Times New Roman"/>
+              </w:rPr>
+            </w:pPr>
           </w:p>
         </w:tc>
       </w:tr>
@@ -404,19 +439,13 @@
               <w:rPr>
                 <w:rFonts w:ascii="Times New Roman" w:hAnsi="Times New Roman" w:cs="Times New Roman"/>
               </w:rPr>
-              <w:t>FR</w:t>
-            </w:r>
-            <w:r>
-              <w:rPr>
-                <w:rFonts w:ascii="Times New Roman" w:hAnsi="Times New Roman" w:cs="Times New Roman"/>
-              </w:rPr>
-              <w:t>4</w:t>
-            </w:r>
-          </w:p>
-        </w:tc>
-        <w:tc>
-          <w:tcPr>
-            <w:tcW w:w="3031" w:type="dxa"/>
+              <w:t>FR4</w:t>
+            </w:r>
+          </w:p>
+        </w:tc>
+        <w:tc>
+          <w:tcPr>
+            <w:tcW w:w="2276" w:type="dxa"/>
           </w:tcPr>
           <w:p>
             <w:pPr>
@@ -434,7 +463,7 @@
         </w:tc>
         <w:tc>
           <w:tcPr>
-            <w:tcW w:w="1267" w:type="dxa"/>
+            <w:tcW w:w="1149" w:type="dxa"/>
           </w:tcPr>
           <w:p>
             <w:pPr>
@@ -452,7 +481,7 @@
         </w:tc>
         <w:tc>
           <w:tcPr>
-            <w:tcW w:w="3159" w:type="dxa"/>
+            <w:tcW w:w="2335" w:type="dxa"/>
           </w:tcPr>
           <w:p>
             <w:pPr>
@@ -466,6 +495,18 @@
               </w:rPr>
               <w:t>Reflects real-world pub usage where users order for themselves or others.</w:t>
             </w:r>
+          </w:p>
+        </w:tc>
+        <w:tc>
+          <w:tcPr>
+            <w:tcW w:w="1697" w:type="dxa"/>
+          </w:tcPr>
+          <w:p>
+            <w:pPr>
+              <w:rPr>
+                <w:rFonts w:ascii="Times New Roman" w:hAnsi="Times New Roman" w:cs="Times New Roman"/>
+              </w:rPr>
+            </w:pPr>
           </w:p>
         </w:tc>
       </w:tr>
@@ -484,19 +525,13 @@
               <w:rPr>
                 <w:rFonts w:ascii="Times New Roman" w:hAnsi="Times New Roman" w:cs="Times New Roman"/>
               </w:rPr>
-              <w:t>FR</w:t>
-            </w:r>
-            <w:r>
-              <w:rPr>
-                <w:rFonts w:ascii="Times New Roman" w:hAnsi="Times New Roman" w:cs="Times New Roman"/>
-              </w:rPr>
-              <w:t>5</w:t>
-            </w:r>
-          </w:p>
-        </w:tc>
-        <w:tc>
-          <w:tcPr>
-            <w:tcW w:w="3031" w:type="dxa"/>
+              <w:t>FR5</w:t>
+            </w:r>
+          </w:p>
+        </w:tc>
+        <w:tc>
+          <w:tcPr>
+            <w:tcW w:w="2276" w:type="dxa"/>
           </w:tcPr>
           <w:p>
             <w:pPr>
@@ -514,7 +549,7 @@
         </w:tc>
         <w:tc>
           <w:tcPr>
-            <w:tcW w:w="1267" w:type="dxa"/>
+            <w:tcW w:w="1149" w:type="dxa"/>
           </w:tcPr>
           <w:p>
             <w:pPr>
@@ -532,7 +567,7 @@
         </w:tc>
         <w:tc>
           <w:tcPr>
-            <w:tcW w:w="3159" w:type="dxa"/>
+            <w:tcW w:w="2335" w:type="dxa"/>
           </w:tcPr>
           <w:p>
             <w:pPr>
@@ -570,6 +605,18 @@
               </w:rPr>
               <w:t>.</w:t>
             </w:r>
+          </w:p>
+        </w:tc>
+        <w:tc>
+          <w:tcPr>
+            <w:tcW w:w="1697" w:type="dxa"/>
+          </w:tcPr>
+          <w:p>
+            <w:pPr>
+              <w:rPr>
+                <w:rFonts w:ascii="Times New Roman" w:hAnsi="Times New Roman" w:cs="Times New Roman"/>
+              </w:rPr>
+            </w:pPr>
           </w:p>
         </w:tc>
       </w:tr>
@@ -588,19 +635,13 @@
               <w:rPr>
                 <w:rFonts w:ascii="Times New Roman" w:hAnsi="Times New Roman" w:cs="Times New Roman"/>
               </w:rPr>
-              <w:t>FR</w:t>
-            </w:r>
-            <w:r>
-              <w:rPr>
-                <w:rFonts w:ascii="Times New Roman" w:hAnsi="Times New Roman" w:cs="Times New Roman"/>
-              </w:rPr>
-              <w:t>6</w:t>
-            </w:r>
-          </w:p>
-        </w:tc>
-        <w:tc>
-          <w:tcPr>
-            <w:tcW w:w="3031" w:type="dxa"/>
+              <w:t>FR6</w:t>
+            </w:r>
+          </w:p>
+        </w:tc>
+        <w:tc>
+          <w:tcPr>
+            <w:tcW w:w="2276" w:type="dxa"/>
           </w:tcPr>
           <w:p>
             <w:pPr>
@@ -618,7 +659,7 @@
         </w:tc>
         <w:tc>
           <w:tcPr>
-            <w:tcW w:w="1267" w:type="dxa"/>
+            <w:tcW w:w="1149" w:type="dxa"/>
           </w:tcPr>
           <w:p>
             <w:pPr>
@@ -636,7 +677,7 @@
         </w:tc>
         <w:tc>
           <w:tcPr>
-            <w:tcW w:w="3159" w:type="dxa"/>
+            <w:tcW w:w="2335" w:type="dxa"/>
           </w:tcPr>
           <w:p>
             <w:pPr>
@@ -650,6 +691,18 @@
               </w:rPr>
               <w:t>Supports transparency and shared cost awareness in group settings.</w:t>
             </w:r>
+          </w:p>
+        </w:tc>
+        <w:tc>
+          <w:tcPr>
+            <w:tcW w:w="1697" w:type="dxa"/>
+          </w:tcPr>
+          <w:p>
+            <w:pPr>
+              <w:rPr>
+                <w:rFonts w:ascii="Times New Roman" w:hAnsi="Times New Roman" w:cs="Times New Roman"/>
+              </w:rPr>
+            </w:pPr>
           </w:p>
         </w:tc>
       </w:tr>
@@ -668,19 +721,13 @@
               <w:rPr>
                 <w:rFonts w:ascii="Times New Roman" w:hAnsi="Times New Roman" w:cs="Times New Roman"/>
               </w:rPr>
-              <w:t>FR</w:t>
-            </w:r>
-            <w:r>
-              <w:rPr>
-                <w:rFonts w:ascii="Times New Roman" w:hAnsi="Times New Roman" w:cs="Times New Roman"/>
-              </w:rPr>
-              <w:t>7</w:t>
-            </w:r>
-          </w:p>
-        </w:tc>
-        <w:tc>
-          <w:tcPr>
-            <w:tcW w:w="3031" w:type="dxa"/>
+              <w:t>FR7</w:t>
+            </w:r>
+          </w:p>
+        </w:tc>
+        <w:tc>
+          <w:tcPr>
+            <w:tcW w:w="2276" w:type="dxa"/>
           </w:tcPr>
           <w:p>
             <w:pPr>
@@ -698,7 +745,7 @@
         </w:tc>
         <w:tc>
           <w:tcPr>
-            <w:tcW w:w="1267" w:type="dxa"/>
+            <w:tcW w:w="1149" w:type="dxa"/>
           </w:tcPr>
           <w:p>
             <w:pPr>
@@ -716,7 +763,7 @@
         </w:tc>
         <w:tc>
           <w:tcPr>
-            <w:tcW w:w="3159" w:type="dxa"/>
+            <w:tcW w:w="2335" w:type="dxa"/>
           </w:tcPr>
           <w:p>
             <w:pPr>
@@ -730,6 +777,18 @@
               </w:rPr>
               <w:t>Prevents errors when ordering multiple items for a group.</w:t>
             </w:r>
+          </w:p>
+        </w:tc>
+        <w:tc>
+          <w:tcPr>
+            <w:tcW w:w="1697" w:type="dxa"/>
+          </w:tcPr>
+          <w:p>
+            <w:pPr>
+              <w:rPr>
+                <w:rFonts w:ascii="Times New Roman" w:hAnsi="Times New Roman" w:cs="Times New Roman"/>
+              </w:rPr>
+            </w:pPr>
           </w:p>
         </w:tc>
       </w:tr>
@@ -748,19 +807,13 @@
               <w:rPr>
                 <w:rFonts w:ascii="Times New Roman" w:hAnsi="Times New Roman" w:cs="Times New Roman"/>
               </w:rPr>
-              <w:t>FR</w:t>
-            </w:r>
-            <w:r>
-              <w:rPr>
-                <w:rFonts w:ascii="Times New Roman" w:hAnsi="Times New Roman" w:cs="Times New Roman"/>
-              </w:rPr>
-              <w:t>8</w:t>
-            </w:r>
-          </w:p>
-        </w:tc>
-        <w:tc>
-          <w:tcPr>
-            <w:tcW w:w="3031" w:type="dxa"/>
+              <w:t>FR8</w:t>
+            </w:r>
+          </w:p>
+        </w:tc>
+        <w:tc>
+          <w:tcPr>
+            <w:tcW w:w="2276" w:type="dxa"/>
           </w:tcPr>
           <w:p>
             <w:pPr>
@@ -778,13 +831,7 @@
               <w:rPr>
                 <w:rFonts w:ascii="Times New Roman" w:hAnsi="Times New Roman" w:cs="Times New Roman"/>
               </w:rPr>
-              <w:t xml:space="preserve">followed by </w:t>
-            </w:r>
-            <w:r>
-              <w:rPr>
-                <w:rFonts w:ascii="Times New Roman" w:hAnsi="Times New Roman" w:cs="Times New Roman"/>
-              </w:rPr>
-              <w:t xml:space="preserve">a “Are you sure?” prompt </w:t>
+              <w:t xml:space="preserve">followed by a “Are you sure?” prompt </w:t>
             </w:r>
             <w:r>
               <w:rPr>
@@ -796,7 +843,7 @@
         </w:tc>
         <w:tc>
           <w:tcPr>
-            <w:tcW w:w="1267" w:type="dxa"/>
+            <w:tcW w:w="1149" w:type="dxa"/>
           </w:tcPr>
           <w:p>
             <w:pPr>
@@ -814,7 +861,7 @@
         </w:tc>
         <w:tc>
           <w:tcPr>
-            <w:tcW w:w="3159" w:type="dxa"/>
+            <w:tcW w:w="2335" w:type="dxa"/>
           </w:tcPr>
           <w:p>
             <w:pPr>
@@ -828,6 +875,18 @@
               </w:rPr>
               <w:t>Ensures users understand when an order is finalized.</w:t>
             </w:r>
+          </w:p>
+        </w:tc>
+        <w:tc>
+          <w:tcPr>
+            <w:tcW w:w="1697" w:type="dxa"/>
+          </w:tcPr>
+          <w:p>
+            <w:pPr>
+              <w:rPr>
+                <w:rFonts w:ascii="Times New Roman" w:hAnsi="Times New Roman" w:cs="Times New Roman"/>
+              </w:rPr>
+            </w:pPr>
           </w:p>
         </w:tc>
       </w:tr>
@@ -846,68 +905,89 @@
               <w:rPr>
                 <w:rFonts w:ascii="Times New Roman" w:hAnsi="Times New Roman" w:cs="Times New Roman"/>
               </w:rPr>
-              <w:t>FR</w:t>
-            </w:r>
-            <w:r>
-              <w:rPr>
-                <w:rFonts w:ascii="Times New Roman" w:hAnsi="Times New Roman" w:cs="Times New Roman"/>
-              </w:rPr>
-              <w:t>9</w:t>
-            </w:r>
-          </w:p>
-        </w:tc>
-        <w:tc>
-          <w:tcPr>
-            <w:tcW w:w="3031" w:type="dxa"/>
-          </w:tcPr>
-          <w:p>
-            <w:pPr>
-              <w:rPr>
-                <w:rFonts w:ascii="Times New Roman" w:hAnsi="Times New Roman" w:cs="Times New Roman"/>
-              </w:rPr>
-            </w:pPr>
-            <w:r>
-              <w:rPr>
-                <w:rFonts w:ascii="Times New Roman" w:hAnsi="Times New Roman" w:cs="Times New Roman"/>
-              </w:rPr>
-              <w:t>The system shall provide clear feedback that an order has been successfully submitted.</w:t>
-            </w:r>
-          </w:p>
-        </w:tc>
-        <w:tc>
-          <w:tcPr>
-            <w:tcW w:w="1267" w:type="dxa"/>
-          </w:tcPr>
-          <w:p>
-            <w:pPr>
-              <w:rPr>
-                <w:rFonts w:ascii="Times New Roman" w:hAnsi="Times New Roman" w:cs="Times New Roman"/>
-              </w:rPr>
-            </w:pPr>
-            <w:r>
-              <w:rPr>
-                <w:rFonts w:ascii="Times New Roman" w:hAnsi="Times New Roman" w:cs="Times New Roman"/>
-              </w:rPr>
+              <w:t>FR9</w:t>
+            </w:r>
+          </w:p>
+        </w:tc>
+        <w:tc>
+          <w:tcPr>
+            <w:tcW w:w="2276" w:type="dxa"/>
+          </w:tcPr>
+          <w:p>
+            <w:pPr>
+              <w:rPr>
+                <w:rFonts w:ascii="Times New Roman" w:hAnsi="Times New Roman" w:cs="Times New Roman"/>
+              </w:rPr>
+            </w:pPr>
+            <w:r>
+              <w:rPr>
+                <w:rFonts w:ascii="Times New Roman" w:hAnsi="Times New Roman" w:cs="Times New Roman"/>
+              </w:rPr>
+              <w:t xml:space="preserve">The system shall provide clear feedback that an </w:t>
+            </w:r>
+            <w:r>
+              <w:rPr>
+                <w:rFonts w:ascii="Times New Roman" w:hAnsi="Times New Roman" w:cs="Times New Roman"/>
+              </w:rPr>
+              <w:lastRenderedPageBreak/>
+              <w:t>order has been successfully submitted.</w:t>
+            </w:r>
+          </w:p>
+        </w:tc>
+        <w:tc>
+          <w:tcPr>
+            <w:tcW w:w="1149" w:type="dxa"/>
+          </w:tcPr>
+          <w:p>
+            <w:pPr>
+              <w:rPr>
+                <w:rFonts w:ascii="Times New Roman" w:hAnsi="Times New Roman" w:cs="Times New Roman"/>
+              </w:rPr>
+            </w:pPr>
+            <w:r>
+              <w:rPr>
+                <w:rFonts w:ascii="Times New Roman" w:hAnsi="Times New Roman" w:cs="Times New Roman"/>
+              </w:rPr>
+              <w:lastRenderedPageBreak/>
               <w:t>Must</w:t>
             </w:r>
           </w:p>
         </w:tc>
         <w:tc>
           <w:tcPr>
-            <w:tcW w:w="3159" w:type="dxa"/>
-          </w:tcPr>
-          <w:p>
-            <w:pPr>
-              <w:rPr>
-                <w:rFonts w:ascii="Times New Roman" w:hAnsi="Times New Roman" w:cs="Times New Roman"/>
-              </w:rPr>
-            </w:pPr>
-            <w:r>
-              <w:rPr>
-                <w:rFonts w:ascii="Times New Roman" w:hAnsi="Times New Roman" w:cs="Times New Roman"/>
-              </w:rPr>
-              <w:t>Removes uncertainty in a noisy and distracting pub environment.</w:t>
-            </w:r>
+            <w:tcW w:w="2335" w:type="dxa"/>
+          </w:tcPr>
+          <w:p>
+            <w:pPr>
+              <w:rPr>
+                <w:rFonts w:ascii="Times New Roman" w:hAnsi="Times New Roman" w:cs="Times New Roman"/>
+              </w:rPr>
+            </w:pPr>
+            <w:r>
+              <w:rPr>
+                <w:rFonts w:ascii="Times New Roman" w:hAnsi="Times New Roman" w:cs="Times New Roman"/>
+              </w:rPr>
+              <w:t xml:space="preserve">Removes uncertainty in a noisy and </w:t>
+            </w:r>
+            <w:r>
+              <w:rPr>
+                <w:rFonts w:ascii="Times New Roman" w:hAnsi="Times New Roman" w:cs="Times New Roman"/>
+              </w:rPr>
+              <w:lastRenderedPageBreak/>
+              <w:t>distracting pub environment.</w:t>
+            </w:r>
+          </w:p>
+        </w:tc>
+        <w:tc>
+          <w:tcPr>
+            <w:tcW w:w="1697" w:type="dxa"/>
+          </w:tcPr>
+          <w:p>
+            <w:pPr>
+              <w:rPr>
+                <w:rFonts w:ascii="Times New Roman" w:hAnsi="Times New Roman" w:cs="Times New Roman"/>
+              </w:rPr>
+            </w:pPr>
           </w:p>
         </w:tc>
       </w:tr>
@@ -926,19 +1006,13 @@
               <w:rPr>
                 <w:rFonts w:ascii="Times New Roman" w:hAnsi="Times New Roman" w:cs="Times New Roman"/>
               </w:rPr>
-              <w:t>FR</w:t>
-            </w:r>
-            <w:r>
-              <w:rPr>
-                <w:rFonts w:ascii="Times New Roman" w:hAnsi="Times New Roman" w:cs="Times New Roman"/>
-              </w:rPr>
-              <w:t>10</w:t>
-            </w:r>
-          </w:p>
-        </w:tc>
-        <w:tc>
-          <w:tcPr>
-            <w:tcW w:w="3031" w:type="dxa"/>
+              <w:t>FR10</w:t>
+            </w:r>
+          </w:p>
+        </w:tc>
+        <w:tc>
+          <w:tcPr>
+            <w:tcW w:w="2276" w:type="dxa"/>
           </w:tcPr>
           <w:p>
             <w:pPr>
@@ -956,7 +1030,7 @@
         </w:tc>
         <w:tc>
           <w:tcPr>
-            <w:tcW w:w="1267" w:type="dxa"/>
+            <w:tcW w:w="1149" w:type="dxa"/>
           </w:tcPr>
           <w:p>
             <w:pPr>
@@ -974,7 +1048,7 @@
         </w:tc>
         <w:tc>
           <w:tcPr>
-            <w:tcW w:w="3159" w:type="dxa"/>
+            <w:tcW w:w="2335" w:type="dxa"/>
           </w:tcPr>
           <w:p>
             <w:pPr>
@@ -988,6 +1062,18 @@
               </w:rPr>
               <w:t>Reduces complexity for distracted and impatient users.</w:t>
             </w:r>
+          </w:p>
+        </w:tc>
+        <w:tc>
+          <w:tcPr>
+            <w:tcW w:w="1697" w:type="dxa"/>
+          </w:tcPr>
+          <w:p>
+            <w:pPr>
+              <w:rPr>
+                <w:rFonts w:ascii="Times New Roman" w:hAnsi="Times New Roman" w:cs="Times New Roman"/>
+              </w:rPr>
+            </w:pPr>
           </w:p>
         </w:tc>
       </w:tr>
@@ -1006,25 +1092,13 @@
               <w:rPr>
                 <w:rFonts w:ascii="Times New Roman" w:hAnsi="Times New Roman" w:cs="Times New Roman"/>
               </w:rPr>
-              <w:t>FR</w:t>
-            </w:r>
-            <w:r>
-              <w:rPr>
-                <w:rFonts w:ascii="Times New Roman" w:hAnsi="Times New Roman" w:cs="Times New Roman"/>
-              </w:rPr>
-              <w:t>1</w:t>
-            </w:r>
-            <w:r>
-              <w:rPr>
-                <w:rFonts w:ascii="Times New Roman" w:hAnsi="Times New Roman" w:cs="Times New Roman"/>
-              </w:rPr>
-              <w:t>1</w:t>
-            </w:r>
-          </w:p>
-        </w:tc>
-        <w:tc>
-          <w:tcPr>
-            <w:tcW w:w="3031" w:type="dxa"/>
+              <w:t>FR11</w:t>
+            </w:r>
+          </w:p>
+        </w:tc>
+        <w:tc>
+          <w:tcPr>
+            <w:tcW w:w="2276" w:type="dxa"/>
           </w:tcPr>
           <w:p>
             <w:pPr>
@@ -1042,7 +1116,7 @@
         </w:tc>
         <w:tc>
           <w:tcPr>
-            <w:tcW w:w="1267" w:type="dxa"/>
+            <w:tcW w:w="1149" w:type="dxa"/>
           </w:tcPr>
           <w:p>
             <w:pPr>
@@ -1060,7 +1134,7 @@
         </w:tc>
         <w:tc>
           <w:tcPr>
-            <w:tcW w:w="3159" w:type="dxa"/>
+            <w:tcW w:w="2335" w:type="dxa"/>
           </w:tcPr>
           <w:p>
             <w:pPr>
@@ -1074,6 +1148,18 @@
               </w:rPr>
               <w:t>Simplifies decision-making and speeds up ordering.</w:t>
             </w:r>
+          </w:p>
+        </w:tc>
+        <w:tc>
+          <w:tcPr>
+            <w:tcW w:w="1697" w:type="dxa"/>
+          </w:tcPr>
+          <w:p>
+            <w:pPr>
+              <w:rPr>
+                <w:rFonts w:ascii="Times New Roman" w:hAnsi="Times New Roman" w:cs="Times New Roman"/>
+              </w:rPr>
+            </w:pPr>
           </w:p>
         </w:tc>
       </w:tr>
@@ -1092,25 +1178,13 @@
               <w:rPr>
                 <w:rFonts w:ascii="Times New Roman" w:hAnsi="Times New Roman" w:cs="Times New Roman"/>
               </w:rPr>
-              <w:t>FR</w:t>
-            </w:r>
-            <w:r>
-              <w:rPr>
-                <w:rFonts w:ascii="Times New Roman" w:hAnsi="Times New Roman" w:cs="Times New Roman"/>
-              </w:rPr>
-              <w:t>1</w:t>
-            </w:r>
-            <w:r>
-              <w:rPr>
-                <w:rFonts w:ascii="Times New Roman" w:hAnsi="Times New Roman" w:cs="Times New Roman"/>
-              </w:rPr>
-              <w:t>2</w:t>
-            </w:r>
-          </w:p>
-        </w:tc>
-        <w:tc>
-          <w:tcPr>
-            <w:tcW w:w="3031" w:type="dxa"/>
+              <w:t>FR12</w:t>
+            </w:r>
+          </w:p>
+        </w:tc>
+        <w:tc>
+          <w:tcPr>
+            <w:tcW w:w="2276" w:type="dxa"/>
           </w:tcPr>
           <w:p>
             <w:pPr>
@@ -1128,7 +1202,7 @@
         </w:tc>
         <w:tc>
           <w:tcPr>
-            <w:tcW w:w="1267" w:type="dxa"/>
+            <w:tcW w:w="1149" w:type="dxa"/>
           </w:tcPr>
           <w:p>
             <w:pPr>
@@ -1146,7 +1220,7 @@
         </w:tc>
         <w:tc>
           <w:tcPr>
-            <w:tcW w:w="3159" w:type="dxa"/>
+            <w:tcW w:w="2335" w:type="dxa"/>
           </w:tcPr>
           <w:p>
             <w:pPr>
@@ -1184,6 +1258,18 @@
               </w:rPr>
               <w:t>.</w:t>
             </w:r>
+          </w:p>
+        </w:tc>
+        <w:tc>
+          <w:tcPr>
+            <w:tcW w:w="1697" w:type="dxa"/>
+          </w:tcPr>
+          <w:p>
+            <w:pPr>
+              <w:rPr>
+                <w:rFonts w:ascii="Times New Roman" w:hAnsi="Times New Roman" w:cs="Times New Roman"/>
+              </w:rPr>
+            </w:pPr>
           </w:p>
         </w:tc>
       </w:tr>
@@ -1202,26 +1288,13 @@
               <w:rPr>
                 <w:rFonts w:ascii="Times New Roman" w:hAnsi="Times New Roman" w:cs="Times New Roman"/>
               </w:rPr>
-              <w:lastRenderedPageBreak/>
-              <w:t>FR</w:t>
-            </w:r>
-            <w:r>
-              <w:rPr>
-                <w:rFonts w:ascii="Times New Roman" w:hAnsi="Times New Roman" w:cs="Times New Roman"/>
-              </w:rPr>
-              <w:t>1</w:t>
-            </w:r>
-            <w:r>
-              <w:rPr>
-                <w:rFonts w:ascii="Times New Roman" w:hAnsi="Times New Roman" w:cs="Times New Roman"/>
-              </w:rPr>
-              <w:t>3</w:t>
-            </w:r>
-          </w:p>
-        </w:tc>
-        <w:tc>
-          <w:tcPr>
-            <w:tcW w:w="3031" w:type="dxa"/>
+              <w:t>FR13</w:t>
+            </w:r>
+          </w:p>
+        </w:tc>
+        <w:tc>
+          <w:tcPr>
+            <w:tcW w:w="2276" w:type="dxa"/>
           </w:tcPr>
           <w:p>
             <w:pPr>
@@ -1263,7 +1336,7 @@
         </w:tc>
         <w:tc>
           <w:tcPr>
-            <w:tcW w:w="1267" w:type="dxa"/>
+            <w:tcW w:w="1149" w:type="dxa"/>
           </w:tcPr>
           <w:p>
             <w:pPr>
@@ -1281,7 +1354,7 @@
         </w:tc>
         <w:tc>
           <w:tcPr>
-            <w:tcW w:w="3159" w:type="dxa"/>
+            <w:tcW w:w="2335" w:type="dxa"/>
           </w:tcPr>
           <w:p>
             <w:pPr>
@@ -1295,6 +1368,18 @@
               </w:rPr>
               <w:t>Ensures safe food choices and reduces health risks.</w:t>
             </w:r>
+          </w:p>
+        </w:tc>
+        <w:tc>
+          <w:tcPr>
+            <w:tcW w:w="1697" w:type="dxa"/>
+          </w:tcPr>
+          <w:p>
+            <w:pPr>
+              <w:rPr>
+                <w:rFonts w:ascii="Times New Roman" w:hAnsi="Times New Roman" w:cs="Times New Roman"/>
+              </w:rPr>
+            </w:pPr>
           </w:p>
         </w:tc>
       </w:tr>
@@ -1313,25 +1398,13 @@
               <w:rPr>
                 <w:rFonts w:ascii="Times New Roman" w:hAnsi="Times New Roman" w:cs="Times New Roman"/>
               </w:rPr>
-              <w:t>FR</w:t>
-            </w:r>
-            <w:r>
-              <w:rPr>
-                <w:rFonts w:ascii="Times New Roman" w:hAnsi="Times New Roman" w:cs="Times New Roman"/>
-              </w:rPr>
-              <w:t>1</w:t>
-            </w:r>
-            <w:r>
-              <w:rPr>
-                <w:rFonts w:ascii="Times New Roman" w:hAnsi="Times New Roman" w:cs="Times New Roman"/>
-              </w:rPr>
-              <w:t>4</w:t>
-            </w:r>
-          </w:p>
-        </w:tc>
-        <w:tc>
-          <w:tcPr>
-            <w:tcW w:w="3031" w:type="dxa"/>
+              <w:t>FR14</w:t>
+            </w:r>
+          </w:p>
+        </w:tc>
+        <w:tc>
+          <w:tcPr>
+            <w:tcW w:w="2276" w:type="dxa"/>
           </w:tcPr>
           <w:p>
             <w:pPr>
@@ -1349,7 +1422,7 @@
         </w:tc>
         <w:tc>
           <w:tcPr>
-            <w:tcW w:w="1267" w:type="dxa"/>
+            <w:tcW w:w="1149" w:type="dxa"/>
           </w:tcPr>
           <w:p>
             <w:pPr>
@@ -1367,7 +1440,7 @@
         </w:tc>
         <w:tc>
           <w:tcPr>
-            <w:tcW w:w="3159" w:type="dxa"/>
+            <w:tcW w:w="2335" w:type="dxa"/>
           </w:tcPr>
           <w:p>
             <w:pPr>
@@ -1381,6 +1454,18 @@
               </w:rPr>
               <w:t>Adds transparency but is not critical for ordering.</w:t>
             </w:r>
+          </w:p>
+        </w:tc>
+        <w:tc>
+          <w:tcPr>
+            <w:tcW w:w="1697" w:type="dxa"/>
+          </w:tcPr>
+          <w:p>
+            <w:pPr>
+              <w:rPr>
+                <w:rFonts w:ascii="Times New Roman" w:hAnsi="Times New Roman" w:cs="Times New Roman"/>
+              </w:rPr>
+            </w:pPr>
           </w:p>
         </w:tc>
       </w:tr>
@@ -1399,25 +1484,13 @@
               <w:rPr>
                 <w:rFonts w:ascii="Times New Roman" w:hAnsi="Times New Roman" w:cs="Times New Roman"/>
               </w:rPr>
-              <w:t>FR</w:t>
-            </w:r>
-            <w:r>
-              <w:rPr>
-                <w:rFonts w:ascii="Times New Roman" w:hAnsi="Times New Roman" w:cs="Times New Roman"/>
-              </w:rPr>
-              <w:t>1</w:t>
-            </w:r>
-            <w:r>
-              <w:rPr>
-                <w:rFonts w:ascii="Times New Roman" w:hAnsi="Times New Roman" w:cs="Times New Roman"/>
-              </w:rPr>
-              <w:t>5</w:t>
-            </w:r>
-          </w:p>
-        </w:tc>
-        <w:tc>
-          <w:tcPr>
-            <w:tcW w:w="3031" w:type="dxa"/>
+              <w:t>FR15</w:t>
+            </w:r>
+          </w:p>
+        </w:tc>
+        <w:tc>
+          <w:tcPr>
+            <w:tcW w:w="2276" w:type="dxa"/>
           </w:tcPr>
           <w:p>
             <w:pPr>
@@ -1459,7 +1532,7 @@
         </w:tc>
         <w:tc>
           <w:tcPr>
-            <w:tcW w:w="1267" w:type="dxa"/>
+            <w:tcW w:w="1149" w:type="dxa"/>
           </w:tcPr>
           <w:p>
             <w:pPr>
@@ -1477,7 +1550,7 @@
         </w:tc>
         <w:tc>
           <w:tcPr>
-            <w:tcW w:w="3159" w:type="dxa"/>
+            <w:tcW w:w="2335" w:type="dxa"/>
           </w:tcPr>
           <w:p>
             <w:pPr>
@@ -1491,6 +1564,18 @@
               </w:rPr>
               <w:t>Helps users make appropriate choices quickly.</w:t>
             </w:r>
+          </w:p>
+        </w:tc>
+        <w:tc>
+          <w:tcPr>
+            <w:tcW w:w="1697" w:type="dxa"/>
+          </w:tcPr>
+          <w:p>
+            <w:pPr>
+              <w:rPr>
+                <w:rFonts w:ascii="Times New Roman" w:hAnsi="Times New Roman" w:cs="Times New Roman"/>
+              </w:rPr>
+            </w:pPr>
           </w:p>
         </w:tc>
       </w:tr>
@@ -1509,25 +1594,13 @@
               <w:rPr>
                 <w:rFonts w:ascii="Times New Roman" w:hAnsi="Times New Roman" w:cs="Times New Roman"/>
               </w:rPr>
-              <w:t>FR</w:t>
-            </w:r>
-            <w:r>
-              <w:rPr>
-                <w:rFonts w:ascii="Times New Roman" w:hAnsi="Times New Roman" w:cs="Times New Roman"/>
-              </w:rPr>
-              <w:t>1</w:t>
-            </w:r>
-            <w:r>
-              <w:rPr>
-                <w:rFonts w:ascii="Times New Roman" w:hAnsi="Times New Roman" w:cs="Times New Roman"/>
-              </w:rPr>
-              <w:t>6</w:t>
-            </w:r>
-          </w:p>
-        </w:tc>
-        <w:tc>
-          <w:tcPr>
-            <w:tcW w:w="3031" w:type="dxa"/>
+              <w:t>FR16</w:t>
+            </w:r>
+          </w:p>
+        </w:tc>
+        <w:tc>
+          <w:tcPr>
+            <w:tcW w:w="2276" w:type="dxa"/>
           </w:tcPr>
           <w:p>
             <w:pPr>
@@ -1545,7 +1618,7 @@
         </w:tc>
         <w:tc>
           <w:tcPr>
-            <w:tcW w:w="1267" w:type="dxa"/>
+            <w:tcW w:w="1149" w:type="dxa"/>
           </w:tcPr>
           <w:p>
             <w:pPr>
@@ -1563,7 +1636,7 @@
         </w:tc>
         <w:tc>
           <w:tcPr>
-            <w:tcW w:w="3159" w:type="dxa"/>
+            <w:tcW w:w="2335" w:type="dxa"/>
           </w:tcPr>
           <w:p>
             <w:pPr>
@@ -1577,6 +1650,18 @@
               </w:rPr>
               <w:t>Ensures speed in a fast-paced, social environment.</w:t>
             </w:r>
+          </w:p>
+        </w:tc>
+        <w:tc>
+          <w:tcPr>
+            <w:tcW w:w="1697" w:type="dxa"/>
+          </w:tcPr>
+          <w:p>
+            <w:pPr>
+              <w:rPr>
+                <w:rFonts w:ascii="Times New Roman" w:hAnsi="Times New Roman" w:cs="Times New Roman"/>
+              </w:rPr>
+            </w:pPr>
           </w:p>
         </w:tc>
       </w:tr>
@@ -1595,25 +1680,13 @@
               <w:rPr>
                 <w:rFonts w:ascii="Times New Roman" w:hAnsi="Times New Roman" w:cs="Times New Roman"/>
               </w:rPr>
-              <w:t>FR</w:t>
-            </w:r>
-            <w:r>
-              <w:rPr>
-                <w:rFonts w:ascii="Times New Roman" w:hAnsi="Times New Roman" w:cs="Times New Roman"/>
-              </w:rPr>
-              <w:t>1</w:t>
-            </w:r>
-            <w:r>
-              <w:rPr>
-                <w:rFonts w:ascii="Times New Roman" w:hAnsi="Times New Roman" w:cs="Times New Roman"/>
-              </w:rPr>
-              <w:t>7</w:t>
-            </w:r>
-          </w:p>
-        </w:tc>
-        <w:tc>
-          <w:tcPr>
-            <w:tcW w:w="3031" w:type="dxa"/>
+              <w:t>FR17</w:t>
+            </w:r>
+          </w:p>
+        </w:tc>
+        <w:tc>
+          <w:tcPr>
+            <w:tcW w:w="2276" w:type="dxa"/>
           </w:tcPr>
           <w:p>
             <w:pPr>
@@ -1631,7 +1704,7 @@
         </w:tc>
         <w:tc>
           <w:tcPr>
-            <w:tcW w:w="1267" w:type="dxa"/>
+            <w:tcW w:w="1149" w:type="dxa"/>
           </w:tcPr>
           <w:p>
             <w:pPr>
@@ -1649,7 +1722,7 @@
         </w:tc>
         <w:tc>
           <w:tcPr>
-            <w:tcW w:w="3159" w:type="dxa"/>
+            <w:tcW w:w="2335" w:type="dxa"/>
           </w:tcPr>
           <w:p>
             <w:pPr>
@@ -1663,6 +1736,18 @@
               </w:rPr>
               <w:t>Enables efficient repeated ordering behavior.</w:t>
             </w:r>
+          </w:p>
+        </w:tc>
+        <w:tc>
+          <w:tcPr>
+            <w:tcW w:w="1697" w:type="dxa"/>
+          </w:tcPr>
+          <w:p>
+            <w:pPr>
+              <w:rPr>
+                <w:rFonts w:ascii="Times New Roman" w:hAnsi="Times New Roman" w:cs="Times New Roman"/>
+              </w:rPr>
+            </w:pPr>
           </w:p>
         </w:tc>
       </w:tr>
@@ -1681,25 +1766,13 @@
               <w:rPr>
                 <w:rFonts w:ascii="Times New Roman" w:hAnsi="Times New Roman" w:cs="Times New Roman"/>
               </w:rPr>
-              <w:t>FR</w:t>
-            </w:r>
-            <w:r>
-              <w:rPr>
-                <w:rFonts w:ascii="Times New Roman" w:hAnsi="Times New Roman" w:cs="Times New Roman"/>
-              </w:rPr>
-              <w:t>1</w:t>
-            </w:r>
-            <w:r>
-              <w:rPr>
-                <w:rFonts w:ascii="Times New Roman" w:hAnsi="Times New Roman" w:cs="Times New Roman"/>
-              </w:rPr>
-              <w:t>8</w:t>
-            </w:r>
-          </w:p>
-        </w:tc>
-        <w:tc>
-          <w:tcPr>
-            <w:tcW w:w="3031" w:type="dxa"/>
+              <w:t>FR18</w:t>
+            </w:r>
+          </w:p>
+        </w:tc>
+        <w:tc>
+          <w:tcPr>
+            <w:tcW w:w="2276" w:type="dxa"/>
           </w:tcPr>
           <w:p>
             <w:pPr>
@@ -1729,7 +1802,7 @@
         </w:tc>
         <w:tc>
           <w:tcPr>
-            <w:tcW w:w="1267" w:type="dxa"/>
+            <w:tcW w:w="1149" w:type="dxa"/>
           </w:tcPr>
           <w:p>
             <w:pPr>
@@ -1747,7 +1820,7 @@
         </w:tc>
         <w:tc>
           <w:tcPr>
-            <w:tcW w:w="3159" w:type="dxa"/>
+            <w:tcW w:w="2335" w:type="dxa"/>
           </w:tcPr>
           <w:p>
             <w:pPr>
@@ -1761,6 +1834,18 @@
               </w:rPr>
               <w:t>Supports quick reordering with minimal effort.</w:t>
             </w:r>
+          </w:p>
+        </w:tc>
+        <w:tc>
+          <w:tcPr>
+            <w:tcW w:w="1697" w:type="dxa"/>
+          </w:tcPr>
+          <w:p>
+            <w:pPr>
+              <w:rPr>
+                <w:rFonts w:ascii="Times New Roman" w:hAnsi="Times New Roman" w:cs="Times New Roman"/>
+              </w:rPr>
+            </w:pPr>
           </w:p>
         </w:tc>
       </w:tr>
@@ -1779,25 +1864,13 @@
               <w:rPr>
                 <w:rFonts w:ascii="Times New Roman" w:hAnsi="Times New Roman" w:cs="Times New Roman"/>
               </w:rPr>
-              <w:t>FR</w:t>
-            </w:r>
-            <w:r>
-              <w:rPr>
-                <w:rFonts w:ascii="Times New Roman" w:hAnsi="Times New Roman" w:cs="Times New Roman"/>
-              </w:rPr>
-              <w:t>1</w:t>
-            </w:r>
-            <w:r>
-              <w:rPr>
-                <w:rFonts w:ascii="Times New Roman" w:hAnsi="Times New Roman" w:cs="Times New Roman"/>
-              </w:rPr>
-              <w:t>9</w:t>
-            </w:r>
-          </w:p>
-        </w:tc>
-        <w:tc>
-          <w:tcPr>
-            <w:tcW w:w="3031" w:type="dxa"/>
+              <w:t>FR19</w:t>
+            </w:r>
+          </w:p>
+        </w:tc>
+        <w:tc>
+          <w:tcPr>
+            <w:tcW w:w="2276" w:type="dxa"/>
           </w:tcPr>
           <w:p>
             <w:pPr>
@@ -1815,7 +1888,14 @@
               <w:rPr>
                 <w:rFonts w:ascii="Times New Roman" w:hAnsi="Times New Roman" w:cs="Times New Roman"/>
               </w:rPr>
-              <w:t xml:space="preserve">ly ordered drinks </w:t>
+              <w:t xml:space="preserve">ly </w:t>
+            </w:r>
+            <w:r>
+              <w:rPr>
+                <w:rFonts w:ascii="Times New Roman" w:hAnsi="Times New Roman" w:cs="Times New Roman"/>
+              </w:rPr>
+              <w:lastRenderedPageBreak/>
+              <w:t xml:space="preserve">ordered drinks </w:t>
             </w:r>
             <w:r>
               <w:rPr>
@@ -1827,25 +1907,26 @@
         </w:tc>
         <w:tc>
           <w:tcPr>
-            <w:tcW w:w="1267" w:type="dxa"/>
-          </w:tcPr>
-          <w:p>
-            <w:pPr>
-              <w:rPr>
-                <w:rFonts w:ascii="Times New Roman" w:hAnsi="Times New Roman" w:cs="Times New Roman"/>
-              </w:rPr>
-            </w:pPr>
-            <w:r>
-              <w:rPr>
-                <w:rFonts w:ascii="Times New Roman" w:hAnsi="Times New Roman" w:cs="Times New Roman"/>
-              </w:rPr>
+            <w:tcW w:w="1149" w:type="dxa"/>
+          </w:tcPr>
+          <w:p>
+            <w:pPr>
+              <w:rPr>
+                <w:rFonts w:ascii="Times New Roman" w:hAnsi="Times New Roman" w:cs="Times New Roman"/>
+              </w:rPr>
+            </w:pPr>
+            <w:r>
+              <w:rPr>
+                <w:rFonts w:ascii="Times New Roman" w:hAnsi="Times New Roman" w:cs="Times New Roman"/>
+              </w:rPr>
+              <w:lastRenderedPageBreak/>
               <w:t>Could</w:t>
             </w:r>
           </w:p>
         </w:tc>
         <w:tc>
           <w:tcPr>
-            <w:tcW w:w="3159" w:type="dxa"/>
+            <w:tcW w:w="2335" w:type="dxa"/>
           </w:tcPr>
           <w:p>
             <w:pPr>
@@ -1859,6 +1940,18 @@
               </w:rPr>
               <w:t>Reflects repetitive ordering patterns during sessions.</w:t>
             </w:r>
+          </w:p>
+        </w:tc>
+        <w:tc>
+          <w:tcPr>
+            <w:tcW w:w="1697" w:type="dxa"/>
+          </w:tcPr>
+          <w:p>
+            <w:pPr>
+              <w:rPr>
+                <w:rFonts w:ascii="Times New Roman" w:hAnsi="Times New Roman" w:cs="Times New Roman"/>
+              </w:rPr>
+            </w:pPr>
           </w:p>
         </w:tc>
       </w:tr>
@@ -1877,19 +1970,13 @@
               <w:rPr>
                 <w:rFonts w:ascii="Times New Roman" w:hAnsi="Times New Roman" w:cs="Times New Roman"/>
               </w:rPr>
-              <w:t>FR</w:t>
-            </w:r>
-            <w:r>
-              <w:rPr>
-                <w:rFonts w:ascii="Times New Roman" w:hAnsi="Times New Roman" w:cs="Times New Roman"/>
-              </w:rPr>
-              <w:t>20</w:t>
-            </w:r>
-          </w:p>
-        </w:tc>
-        <w:tc>
-          <w:tcPr>
-            <w:tcW w:w="3031" w:type="dxa"/>
+              <w:t>FR20</w:t>
+            </w:r>
+          </w:p>
+        </w:tc>
+        <w:tc>
+          <w:tcPr>
+            <w:tcW w:w="2276" w:type="dxa"/>
           </w:tcPr>
           <w:p>
             <w:pPr>
@@ -1907,7 +1994,7 @@
         </w:tc>
         <w:tc>
           <w:tcPr>
-            <w:tcW w:w="1267" w:type="dxa"/>
+            <w:tcW w:w="1149" w:type="dxa"/>
           </w:tcPr>
           <w:p>
             <w:pPr>
@@ -1925,7 +2012,7 @@
         </w:tc>
         <w:tc>
           <w:tcPr>
-            <w:tcW w:w="3159" w:type="dxa"/>
+            <w:tcW w:w="2335" w:type="dxa"/>
           </w:tcPr>
           <w:p>
             <w:pPr>
@@ -1939,6 +2026,18 @@
               </w:rPr>
               <w:t>Matches real pub usage without interruptions.</w:t>
             </w:r>
+          </w:p>
+        </w:tc>
+        <w:tc>
+          <w:tcPr>
+            <w:tcW w:w="1697" w:type="dxa"/>
+          </w:tcPr>
+          <w:p>
+            <w:pPr>
+              <w:rPr>
+                <w:rFonts w:ascii="Times New Roman" w:hAnsi="Times New Roman" w:cs="Times New Roman"/>
+              </w:rPr>
+            </w:pPr>
           </w:p>
         </w:tc>
       </w:tr>
@@ -1957,25 +2056,13 @@
               <w:rPr>
                 <w:rFonts w:ascii="Times New Roman" w:hAnsi="Times New Roman" w:cs="Times New Roman"/>
               </w:rPr>
-              <w:t>FR</w:t>
-            </w:r>
-            <w:r>
-              <w:rPr>
-                <w:rFonts w:ascii="Times New Roman" w:hAnsi="Times New Roman" w:cs="Times New Roman"/>
-              </w:rPr>
-              <w:t>2</w:t>
-            </w:r>
-            <w:r>
-              <w:rPr>
-                <w:rFonts w:ascii="Times New Roman" w:hAnsi="Times New Roman" w:cs="Times New Roman"/>
-              </w:rPr>
-              <w:t>1</w:t>
-            </w:r>
-          </w:p>
-        </w:tc>
-        <w:tc>
-          <w:tcPr>
-            <w:tcW w:w="3031" w:type="dxa"/>
+              <w:t>FR21</w:t>
+            </w:r>
+          </w:p>
+        </w:tc>
+        <w:tc>
+          <w:tcPr>
+            <w:tcW w:w="2276" w:type="dxa"/>
           </w:tcPr>
           <w:p>
             <w:pPr>
@@ -1993,7 +2080,7 @@
         </w:tc>
         <w:tc>
           <w:tcPr>
-            <w:tcW w:w="1267" w:type="dxa"/>
+            <w:tcW w:w="1149" w:type="dxa"/>
           </w:tcPr>
           <w:p>
             <w:pPr>
@@ -2011,7 +2098,7 @@
         </w:tc>
         <w:tc>
           <w:tcPr>
-            <w:tcW w:w="3159" w:type="dxa"/>
+            <w:tcW w:w="2335" w:type="dxa"/>
           </w:tcPr>
           <w:p>
             <w:pPr>
@@ -2029,14 +2116,20 @@
               <w:rPr>
                 <w:rFonts w:ascii="Times New Roman" w:hAnsi="Times New Roman" w:cs="Times New Roman"/>
               </w:rPr>
-              <w:t xml:space="preserve"> of </w:t>
-            </w:r>
-            <w:r>
-              <w:rPr>
-                <w:rFonts w:ascii="Times New Roman" w:hAnsi="Times New Roman" w:cs="Times New Roman"/>
-              </w:rPr>
-              <w:t>the current order.</w:t>
-            </w:r>
+              <w:t xml:space="preserve"> of the current order.</w:t>
+            </w:r>
+          </w:p>
+        </w:tc>
+        <w:tc>
+          <w:tcPr>
+            <w:tcW w:w="1697" w:type="dxa"/>
+          </w:tcPr>
+          <w:p>
+            <w:pPr>
+              <w:rPr>
+                <w:rFonts w:ascii="Times New Roman" w:hAnsi="Times New Roman" w:cs="Times New Roman"/>
+              </w:rPr>
+            </w:pPr>
           </w:p>
         </w:tc>
       </w:tr>
@@ -2055,25 +2148,13 @@
               <w:rPr>
                 <w:rFonts w:ascii="Times New Roman" w:hAnsi="Times New Roman" w:cs="Times New Roman"/>
               </w:rPr>
-              <w:t>FR</w:t>
-            </w:r>
-            <w:r>
-              <w:rPr>
-                <w:rFonts w:ascii="Times New Roman" w:hAnsi="Times New Roman" w:cs="Times New Roman"/>
-              </w:rPr>
-              <w:t>2</w:t>
-            </w:r>
-            <w:r>
-              <w:rPr>
-                <w:rFonts w:ascii="Times New Roman" w:hAnsi="Times New Roman" w:cs="Times New Roman"/>
-              </w:rPr>
-              <w:t>2</w:t>
-            </w:r>
-          </w:p>
-        </w:tc>
-        <w:tc>
-          <w:tcPr>
-            <w:tcW w:w="3031" w:type="dxa"/>
+              <w:t>FR22</w:t>
+            </w:r>
+          </w:p>
+        </w:tc>
+        <w:tc>
+          <w:tcPr>
+            <w:tcW w:w="2276" w:type="dxa"/>
           </w:tcPr>
           <w:p>
             <w:pPr>
@@ -2091,25 +2172,13 @@
               <w:rPr>
                 <w:rFonts w:ascii="Times New Roman" w:hAnsi="Times New Roman" w:cs="Times New Roman"/>
               </w:rPr>
-              <w:t xml:space="preserve"> This shall be implemented through </w:t>
-            </w:r>
-            <w:r>
-              <w:rPr>
-                <w:rFonts w:ascii="Times New Roman" w:hAnsi="Times New Roman" w:cs="Times New Roman"/>
-              </w:rPr>
-              <w:t xml:space="preserve">both: </w:t>
-            </w:r>
-            <w:r>
-              <w:rPr>
-                <w:rFonts w:ascii="Times New Roman" w:hAnsi="Times New Roman" w:cs="Times New Roman"/>
-              </w:rPr>
-              <w:t>a drag and drop function and buttons</w:t>
-            </w:r>
-          </w:p>
-        </w:tc>
-        <w:tc>
-          <w:tcPr>
-            <w:tcW w:w="1267" w:type="dxa"/>
+              <w:t xml:space="preserve"> This shall be implemented through both: a drag and drop function and buttons</w:t>
+            </w:r>
+          </w:p>
+        </w:tc>
+        <w:tc>
+          <w:tcPr>
+            <w:tcW w:w="1149" w:type="dxa"/>
           </w:tcPr>
           <w:p>
             <w:pPr>
@@ -2127,7 +2196,7 @@
         </w:tc>
         <w:tc>
           <w:tcPr>
-            <w:tcW w:w="3159" w:type="dxa"/>
+            <w:tcW w:w="2335" w:type="dxa"/>
           </w:tcPr>
           <w:p>
             <w:pPr>
@@ -2141,6 +2210,18 @@
               </w:rPr>
               <w:t>Provides flexibility and supports different interaction preferences.</w:t>
             </w:r>
+          </w:p>
+        </w:tc>
+        <w:tc>
+          <w:tcPr>
+            <w:tcW w:w="1697" w:type="dxa"/>
+          </w:tcPr>
+          <w:p>
+            <w:pPr>
+              <w:rPr>
+                <w:rFonts w:ascii="Times New Roman" w:hAnsi="Times New Roman" w:cs="Times New Roman"/>
+              </w:rPr>
+            </w:pPr>
           </w:p>
         </w:tc>
       </w:tr>
@@ -2165,7 +2246,7 @@
         </w:tc>
         <w:tc>
           <w:tcPr>
-            <w:tcW w:w="3031" w:type="dxa"/>
+            <w:tcW w:w="2276" w:type="dxa"/>
           </w:tcPr>
           <w:p>
             <w:pPr>
@@ -2183,7 +2264,7 @@
         </w:tc>
         <w:tc>
           <w:tcPr>
-            <w:tcW w:w="1267" w:type="dxa"/>
+            <w:tcW w:w="1149" w:type="dxa"/>
           </w:tcPr>
           <w:p>
             <w:pPr>
@@ -2201,7 +2282,7 @@
         </w:tc>
         <w:tc>
           <w:tcPr>
-            <w:tcW w:w="3159" w:type="dxa"/>
+            <w:tcW w:w="2335" w:type="dxa"/>
           </w:tcPr>
           <w:p>
             <w:pPr>
@@ -2215,6 +2296,18 @@
               </w:rPr>
               <w:t>Supports error recovery in fast-paced and imprecise interactions.</w:t>
             </w:r>
+          </w:p>
+        </w:tc>
+        <w:tc>
+          <w:tcPr>
+            <w:tcW w:w="1697" w:type="dxa"/>
+          </w:tcPr>
+          <w:p>
+            <w:pPr>
+              <w:rPr>
+                <w:rFonts w:ascii="Times New Roman" w:hAnsi="Times New Roman" w:cs="Times New Roman"/>
+              </w:rPr>
+            </w:pPr>
           </w:p>
         </w:tc>
       </w:tr>
@@ -2233,25 +2326,13 @@
               <w:rPr>
                 <w:rFonts w:ascii="Times New Roman" w:hAnsi="Times New Roman" w:cs="Times New Roman"/>
               </w:rPr>
-              <w:t>FR</w:t>
-            </w:r>
-            <w:r>
-              <w:rPr>
-                <w:rFonts w:ascii="Times New Roman" w:hAnsi="Times New Roman" w:cs="Times New Roman"/>
-              </w:rPr>
-              <w:t>2</w:t>
-            </w:r>
-            <w:r>
-              <w:rPr>
-                <w:rFonts w:ascii="Times New Roman" w:hAnsi="Times New Roman" w:cs="Times New Roman"/>
-              </w:rPr>
-              <w:t>4</w:t>
-            </w:r>
-          </w:p>
-        </w:tc>
-        <w:tc>
-          <w:tcPr>
-            <w:tcW w:w="3031" w:type="dxa"/>
+              <w:t>FR24</w:t>
+            </w:r>
+          </w:p>
+        </w:tc>
+        <w:tc>
+          <w:tcPr>
+            <w:tcW w:w="2276" w:type="dxa"/>
           </w:tcPr>
           <w:p>
             <w:pPr>
@@ -2281,7 +2362,7 @@
         </w:tc>
         <w:tc>
           <w:tcPr>
-            <w:tcW w:w="1267" w:type="dxa"/>
+            <w:tcW w:w="1149" w:type="dxa"/>
           </w:tcPr>
           <w:p>
             <w:pPr>
@@ -2299,7 +2380,7 @@
         </w:tc>
         <w:tc>
           <w:tcPr>
-            <w:tcW w:w="3159" w:type="dxa"/>
+            <w:tcW w:w="2335" w:type="dxa"/>
           </w:tcPr>
           <w:p>
             <w:pPr>
@@ -2313,6 +2394,18 @@
               </w:rPr>
               <w:t>Reduces uncertainty in a noisy and distracting environment.</w:t>
             </w:r>
+          </w:p>
+        </w:tc>
+        <w:tc>
+          <w:tcPr>
+            <w:tcW w:w="1697" w:type="dxa"/>
+          </w:tcPr>
+          <w:p>
+            <w:pPr>
+              <w:rPr>
+                <w:rFonts w:ascii="Times New Roman" w:hAnsi="Times New Roman" w:cs="Times New Roman"/>
+              </w:rPr>
+            </w:pPr>
           </w:p>
         </w:tc>
       </w:tr>
@@ -2331,25 +2424,13 @@
               <w:rPr>
                 <w:rFonts w:ascii="Times New Roman" w:hAnsi="Times New Roman" w:cs="Times New Roman"/>
               </w:rPr>
-              <w:t>FR</w:t>
-            </w:r>
-            <w:r>
-              <w:rPr>
-                <w:rFonts w:ascii="Times New Roman" w:hAnsi="Times New Roman" w:cs="Times New Roman"/>
-              </w:rPr>
-              <w:t>2</w:t>
-            </w:r>
-            <w:r>
-              <w:rPr>
-                <w:rFonts w:ascii="Times New Roman" w:hAnsi="Times New Roman" w:cs="Times New Roman"/>
-              </w:rPr>
-              <w:t>5</w:t>
-            </w:r>
-          </w:p>
-        </w:tc>
-        <w:tc>
-          <w:tcPr>
-            <w:tcW w:w="3031" w:type="dxa"/>
+              <w:t>FR25</w:t>
+            </w:r>
+          </w:p>
+        </w:tc>
+        <w:tc>
+          <w:tcPr>
+            <w:tcW w:w="2276" w:type="dxa"/>
           </w:tcPr>
           <w:p>
             <w:pPr>
@@ -2367,7 +2448,7 @@
         </w:tc>
         <w:tc>
           <w:tcPr>
-            <w:tcW w:w="1267" w:type="dxa"/>
+            <w:tcW w:w="1149" w:type="dxa"/>
           </w:tcPr>
           <w:p>
             <w:pPr>
@@ -2385,7 +2466,7 @@
         </w:tc>
         <w:tc>
           <w:tcPr>
-            <w:tcW w:w="3159" w:type="dxa"/>
+            <w:tcW w:w="2335" w:type="dxa"/>
           </w:tcPr>
           <w:p>
             <w:pPr>
@@ -2399,6 +2480,18 @@
               </w:rPr>
               <w:t>Reduces frustration during waiting times.</w:t>
             </w:r>
+          </w:p>
+        </w:tc>
+        <w:tc>
+          <w:tcPr>
+            <w:tcW w:w="1697" w:type="dxa"/>
+          </w:tcPr>
+          <w:p>
+            <w:pPr>
+              <w:rPr>
+                <w:rFonts w:ascii="Times New Roman" w:hAnsi="Times New Roman" w:cs="Times New Roman"/>
+              </w:rPr>
+            </w:pPr>
           </w:p>
         </w:tc>
       </w:tr>
@@ -2417,25 +2510,13 @@
               <w:rPr>
                 <w:rFonts w:ascii="Times New Roman" w:hAnsi="Times New Roman" w:cs="Times New Roman"/>
               </w:rPr>
-              <w:t>FR</w:t>
-            </w:r>
-            <w:r>
-              <w:rPr>
-                <w:rFonts w:ascii="Times New Roman" w:hAnsi="Times New Roman" w:cs="Times New Roman"/>
-              </w:rPr>
-              <w:t>2</w:t>
-            </w:r>
-            <w:r>
-              <w:rPr>
-                <w:rFonts w:ascii="Times New Roman" w:hAnsi="Times New Roman" w:cs="Times New Roman"/>
-              </w:rPr>
-              <w:t>6</w:t>
-            </w:r>
-          </w:p>
-        </w:tc>
-        <w:tc>
-          <w:tcPr>
-            <w:tcW w:w="3031" w:type="dxa"/>
+              <w:t>FR26</w:t>
+            </w:r>
+          </w:p>
+        </w:tc>
+        <w:tc>
+          <w:tcPr>
+            <w:tcW w:w="2276" w:type="dxa"/>
           </w:tcPr>
           <w:p>
             <w:pPr>
@@ -2453,7 +2534,7 @@
         </w:tc>
         <w:tc>
           <w:tcPr>
-            <w:tcW w:w="1267" w:type="dxa"/>
+            <w:tcW w:w="1149" w:type="dxa"/>
           </w:tcPr>
           <w:p>
             <w:pPr>
@@ -2471,7 +2552,7 @@
         </w:tc>
         <w:tc>
           <w:tcPr>
-            <w:tcW w:w="3159" w:type="dxa"/>
+            <w:tcW w:w="2335" w:type="dxa"/>
           </w:tcPr>
           <w:p>
             <w:pPr>
@@ -2485,6 +2566,18 @@
               </w:rPr>
               <w:t>Supports support when it is needed.</w:t>
             </w:r>
+          </w:p>
+        </w:tc>
+        <w:tc>
+          <w:tcPr>
+            <w:tcW w:w="1697" w:type="dxa"/>
+          </w:tcPr>
+          <w:p>
+            <w:pPr>
+              <w:rPr>
+                <w:rFonts w:ascii="Times New Roman" w:hAnsi="Times New Roman" w:cs="Times New Roman"/>
+              </w:rPr>
+            </w:pPr>
           </w:p>
         </w:tc>
       </w:tr>
@@ -2503,50 +2596,31 @@
               <w:rPr>
                 <w:rFonts w:ascii="Times New Roman" w:hAnsi="Times New Roman" w:cs="Times New Roman"/>
               </w:rPr>
-              <w:lastRenderedPageBreak/>
-              <w:t>FR</w:t>
-            </w:r>
-            <w:r>
-              <w:rPr>
-                <w:rFonts w:ascii="Times New Roman" w:hAnsi="Times New Roman" w:cs="Times New Roman"/>
-              </w:rPr>
-              <w:t>2</w:t>
-            </w:r>
-            <w:r>
-              <w:rPr>
-                <w:rFonts w:ascii="Times New Roman" w:hAnsi="Times New Roman" w:cs="Times New Roman"/>
-              </w:rPr>
-              <w:t>7</w:t>
-            </w:r>
-          </w:p>
-        </w:tc>
-        <w:tc>
-          <w:tcPr>
-            <w:tcW w:w="3031" w:type="dxa"/>
-          </w:tcPr>
-          <w:p>
-            <w:pPr>
-              <w:rPr>
-                <w:rFonts w:ascii="Times New Roman" w:hAnsi="Times New Roman" w:cs="Times New Roman"/>
-              </w:rPr>
-            </w:pPr>
-            <w:r>
-              <w:rPr>
-                <w:rFonts w:ascii="Times New Roman" w:hAnsi="Times New Roman" w:cs="Times New Roman"/>
-              </w:rPr>
-              <w:t xml:space="preserve">The system shall provide visual </w:t>
-            </w:r>
-            <w:r>
-              <w:rPr>
-                <w:rFonts w:ascii="Times New Roman" w:hAnsi="Times New Roman" w:cs="Times New Roman"/>
-              </w:rPr>
-              <w:t>feedback whe staff have been called</w:t>
-            </w:r>
-          </w:p>
-        </w:tc>
-        <w:tc>
-          <w:tcPr>
-            <w:tcW w:w="1267" w:type="dxa"/>
+              <w:t>FR27</w:t>
+            </w:r>
+          </w:p>
+        </w:tc>
+        <w:tc>
+          <w:tcPr>
+            <w:tcW w:w="2276" w:type="dxa"/>
+          </w:tcPr>
+          <w:p>
+            <w:pPr>
+              <w:rPr>
+                <w:rFonts w:ascii="Times New Roman" w:hAnsi="Times New Roman" w:cs="Times New Roman"/>
+              </w:rPr>
+            </w:pPr>
+            <w:r>
+              <w:rPr>
+                <w:rFonts w:ascii="Times New Roman" w:hAnsi="Times New Roman" w:cs="Times New Roman"/>
+              </w:rPr>
+              <w:t>The system shall provide visual feedback whe staff have been called</w:t>
+            </w:r>
+          </w:p>
+        </w:tc>
+        <w:tc>
+          <w:tcPr>
+            <w:tcW w:w="1149" w:type="dxa"/>
           </w:tcPr>
           <w:p>
             <w:pPr>
@@ -2564,7 +2638,7 @@
         </w:tc>
         <w:tc>
           <w:tcPr>
-            <w:tcW w:w="3159" w:type="dxa"/>
+            <w:tcW w:w="2335" w:type="dxa"/>
           </w:tcPr>
           <w:p>
             <w:pPr>
@@ -2578,6 +2652,18 @@
               </w:rPr>
               <w:t>Confirms action in a noisy environment.</w:t>
             </w:r>
+          </w:p>
+        </w:tc>
+        <w:tc>
+          <w:tcPr>
+            <w:tcW w:w="1697" w:type="dxa"/>
+          </w:tcPr>
+          <w:p>
+            <w:pPr>
+              <w:rPr>
+                <w:rFonts w:ascii="Times New Roman" w:hAnsi="Times New Roman" w:cs="Times New Roman"/>
+              </w:rPr>
+            </w:pPr>
           </w:p>
         </w:tc>
       </w:tr>
@@ -2596,19 +2682,13 @@
               <w:rPr>
                 <w:rFonts w:ascii="Times New Roman" w:hAnsi="Times New Roman" w:cs="Times New Roman"/>
               </w:rPr>
-              <w:t>FR2</w:t>
-            </w:r>
-            <w:r>
-              <w:rPr>
-                <w:rFonts w:ascii="Times New Roman" w:hAnsi="Times New Roman" w:cs="Times New Roman"/>
-              </w:rPr>
-              <w:t>8</w:t>
-            </w:r>
-          </w:p>
-        </w:tc>
-        <w:tc>
-          <w:tcPr>
-            <w:tcW w:w="3031" w:type="dxa"/>
+              <w:t>FR28</w:t>
+            </w:r>
+          </w:p>
+        </w:tc>
+        <w:tc>
+          <w:tcPr>
+            <w:tcW w:w="2276" w:type="dxa"/>
           </w:tcPr>
           <w:p>
             <w:pPr>
@@ -2626,7 +2706,7 @@
         </w:tc>
         <w:tc>
           <w:tcPr>
-            <w:tcW w:w="1267" w:type="dxa"/>
+            <w:tcW w:w="1149" w:type="dxa"/>
           </w:tcPr>
           <w:p>
             <w:pPr>
@@ -2644,7 +2724,7 @@
         </w:tc>
         <w:tc>
           <w:tcPr>
-            <w:tcW w:w="3159" w:type="dxa"/>
+            <w:tcW w:w="2335" w:type="dxa"/>
           </w:tcPr>
           <w:p>
             <w:pPr>
@@ -2664,6 +2744,18 @@
               </w:rPr>
               <w:t>.</w:t>
             </w:r>
+          </w:p>
+        </w:tc>
+        <w:tc>
+          <w:tcPr>
+            <w:tcW w:w="1697" w:type="dxa"/>
+          </w:tcPr>
+          <w:p>
+            <w:pPr>
+              <w:rPr>
+                <w:rFonts w:ascii="Times New Roman" w:hAnsi="Times New Roman" w:cs="Times New Roman"/>
+              </w:rPr>
+            </w:pPr>
           </w:p>
         </w:tc>
       </w:tr>
@@ -2682,55 +2774,57 @@
               <w:rPr>
                 <w:rFonts w:ascii="Times New Roman" w:hAnsi="Times New Roman" w:cs="Times New Roman"/>
               </w:rPr>
-              <w:t>FR2</w:t>
-            </w:r>
-            <w:r>
-              <w:rPr>
-                <w:rFonts w:ascii="Times New Roman" w:hAnsi="Times New Roman" w:cs="Times New Roman"/>
-              </w:rPr>
-              <w:t>9</w:t>
-            </w:r>
-          </w:p>
-        </w:tc>
-        <w:tc>
-          <w:tcPr>
-            <w:tcW w:w="3031" w:type="dxa"/>
-          </w:tcPr>
-          <w:p>
-            <w:pPr>
-              <w:rPr>
-                <w:rFonts w:ascii="Times New Roman" w:hAnsi="Times New Roman" w:cs="Times New Roman"/>
-              </w:rPr>
-            </w:pPr>
-            <w:r>
-              <w:rPr>
-                <w:rFonts w:ascii="Times New Roman" w:hAnsi="Times New Roman" w:cs="Times New Roman"/>
-              </w:rPr>
-              <w:t>The system shall provide visual feedback when the bill has been requested.</w:t>
-            </w:r>
-          </w:p>
-        </w:tc>
-        <w:tc>
-          <w:tcPr>
-            <w:tcW w:w="1267" w:type="dxa"/>
-          </w:tcPr>
-          <w:p>
-            <w:pPr>
-              <w:rPr>
-                <w:rFonts w:ascii="Times New Roman" w:hAnsi="Times New Roman" w:cs="Times New Roman"/>
-              </w:rPr>
-            </w:pPr>
-            <w:r>
-              <w:rPr>
-                <w:rFonts w:ascii="Times New Roman" w:hAnsi="Times New Roman" w:cs="Times New Roman"/>
-              </w:rPr>
+              <w:t>FR29</w:t>
+            </w:r>
+          </w:p>
+        </w:tc>
+        <w:tc>
+          <w:tcPr>
+            <w:tcW w:w="2276" w:type="dxa"/>
+          </w:tcPr>
+          <w:p>
+            <w:pPr>
+              <w:rPr>
+                <w:rFonts w:ascii="Times New Roman" w:hAnsi="Times New Roman" w:cs="Times New Roman"/>
+              </w:rPr>
+            </w:pPr>
+            <w:r>
+              <w:rPr>
+                <w:rFonts w:ascii="Times New Roman" w:hAnsi="Times New Roman" w:cs="Times New Roman"/>
+              </w:rPr>
+              <w:t xml:space="preserve">The system shall provide visual feedback when the </w:t>
+            </w:r>
+            <w:r>
+              <w:rPr>
+                <w:rFonts w:ascii="Times New Roman" w:hAnsi="Times New Roman" w:cs="Times New Roman"/>
+              </w:rPr>
+              <w:lastRenderedPageBreak/>
+              <w:t>bill has been requested.</w:t>
+            </w:r>
+          </w:p>
+        </w:tc>
+        <w:tc>
+          <w:tcPr>
+            <w:tcW w:w="1149" w:type="dxa"/>
+          </w:tcPr>
+          <w:p>
+            <w:pPr>
+              <w:rPr>
+                <w:rFonts w:ascii="Times New Roman" w:hAnsi="Times New Roman" w:cs="Times New Roman"/>
+              </w:rPr>
+            </w:pPr>
+            <w:r>
+              <w:rPr>
+                <w:rFonts w:ascii="Times New Roman" w:hAnsi="Times New Roman" w:cs="Times New Roman"/>
+              </w:rPr>
+              <w:lastRenderedPageBreak/>
               <w:t>Should</w:t>
             </w:r>
           </w:p>
         </w:tc>
         <w:tc>
           <w:tcPr>
-            <w:tcW w:w="3159" w:type="dxa"/>
+            <w:tcW w:w="2335" w:type="dxa"/>
           </w:tcPr>
           <w:p>
             <w:pPr>
@@ -2744,6 +2838,18 @@
               </w:rPr>
               <w:t>Confirms the action in a noisy and distracting environment.</w:t>
             </w:r>
+          </w:p>
+        </w:tc>
+        <w:tc>
+          <w:tcPr>
+            <w:tcW w:w="1697" w:type="dxa"/>
+          </w:tcPr>
+          <w:p>
+            <w:pPr>
+              <w:rPr>
+                <w:rFonts w:ascii="Times New Roman" w:hAnsi="Times New Roman" w:cs="Times New Roman"/>
+              </w:rPr>
+            </w:pPr>
           </w:p>
         </w:tc>
       </w:tr>
@@ -2762,19 +2868,13 @@
               <w:rPr>
                 <w:rFonts w:ascii="Times New Roman" w:hAnsi="Times New Roman" w:cs="Times New Roman"/>
               </w:rPr>
-              <w:t>FR</w:t>
-            </w:r>
-            <w:r>
-              <w:rPr>
-                <w:rFonts w:ascii="Times New Roman" w:hAnsi="Times New Roman" w:cs="Times New Roman"/>
-              </w:rPr>
-              <w:t>30</w:t>
-            </w:r>
-          </w:p>
-        </w:tc>
-        <w:tc>
-          <w:tcPr>
-            <w:tcW w:w="3031" w:type="dxa"/>
+              <w:t>FR30</w:t>
+            </w:r>
+          </w:p>
+        </w:tc>
+        <w:tc>
+          <w:tcPr>
+            <w:tcW w:w="2276" w:type="dxa"/>
           </w:tcPr>
           <w:p>
             <w:pPr>
@@ -2792,7 +2892,7 @@
         </w:tc>
         <w:tc>
           <w:tcPr>
-            <w:tcW w:w="1267" w:type="dxa"/>
+            <w:tcW w:w="1149" w:type="dxa"/>
           </w:tcPr>
           <w:p>
             <w:pPr>
@@ -2810,7 +2910,7 @@
         </w:tc>
         <w:tc>
           <w:tcPr>
-            <w:tcW w:w="3159" w:type="dxa"/>
+            <w:tcW w:w="2335" w:type="dxa"/>
           </w:tcPr>
           <w:p>
             <w:pPr>
@@ -2824,6 +2924,18 @@
               </w:rPr>
               <w:t>Ensures system is ready for the next group.</w:t>
             </w:r>
+          </w:p>
+        </w:tc>
+        <w:tc>
+          <w:tcPr>
+            <w:tcW w:w="1697" w:type="dxa"/>
+          </w:tcPr>
+          <w:p>
+            <w:pPr>
+              <w:rPr>
+                <w:rFonts w:ascii="Times New Roman" w:hAnsi="Times New Roman" w:cs="Times New Roman"/>
+              </w:rPr>
+            </w:pPr>
           </w:p>
         </w:tc>
       </w:tr>
@@ -2857,17 +2969,7 @@
           <w:sz w:val="32"/>
           <w:szCs w:val="32"/>
         </w:rPr>
-        <w:t>Non-f</w:t>
-      </w:r>
-      <w:r>
-        <w:rPr>
-          <w:rFonts w:ascii="Times New Roman" w:hAnsi="Times New Roman" w:cs="Times New Roman"/>
-          <w:b/>
-          <w:bCs/>
-          <w:sz w:val="32"/>
-          <w:szCs w:val="32"/>
-        </w:rPr>
-        <w:t>unctional requirements</w:t>
+        <w:t>Non-functional requirements</w:t>
       </w:r>
     </w:p>
     <w:tbl>
@@ -3061,13 +3163,7 @@
               <w:rPr>
                 <w:rFonts w:ascii="Times New Roman" w:hAnsi="Times New Roman" w:cs="Times New Roman"/>
               </w:rPr>
-              <w:t>NFR</w:t>
-            </w:r>
-            <w:r>
-              <w:rPr>
-                <w:rFonts w:ascii="Times New Roman" w:hAnsi="Times New Roman" w:cs="Times New Roman"/>
-              </w:rPr>
-              <w:t>2</w:t>
+              <w:t>NFR2</w:t>
             </w:r>
           </w:p>
         </w:tc>
@@ -3121,13 +3217,7 @@
               <w:rPr>
                 <w:rFonts w:ascii="Times New Roman" w:hAnsi="Times New Roman" w:cs="Times New Roman"/>
               </w:rPr>
-              <w:t>Users expect immediate usability</w:t>
-            </w:r>
-            <w:r>
-              <w:rPr>
-                <w:rFonts w:ascii="Times New Roman" w:hAnsi="Times New Roman" w:cs="Times New Roman"/>
-              </w:rPr>
-              <w:t xml:space="preserve"> in </w:t>
+              <w:t xml:space="preserve">Users expect immediate usability in </w:t>
             </w:r>
             <w:r>
               <w:rPr>
@@ -3161,13 +3251,7 @@
               <w:rPr>
                 <w:rFonts w:ascii="Times New Roman" w:hAnsi="Times New Roman" w:cs="Times New Roman"/>
               </w:rPr>
-              <w:t>NFR</w:t>
-            </w:r>
-            <w:r>
-              <w:rPr>
-                <w:rFonts w:ascii="Times New Roman" w:hAnsi="Times New Roman" w:cs="Times New Roman"/>
-              </w:rPr>
-              <w:t>3</w:t>
+              <w:t>NFR3</w:t>
             </w:r>
           </w:p>
         </w:tc>
@@ -3245,13 +3329,7 @@
               <w:rPr>
                 <w:rFonts w:ascii="Times New Roman" w:hAnsi="Times New Roman" w:cs="Times New Roman"/>
               </w:rPr>
-              <w:t>NFR</w:t>
-            </w:r>
-            <w:r>
-              <w:rPr>
-                <w:rFonts w:ascii="Times New Roman" w:hAnsi="Times New Roman" w:cs="Times New Roman"/>
-              </w:rPr>
-              <w:t>4</w:t>
+              <w:t>NFR4</w:t>
             </w:r>
           </w:p>
         </w:tc>
@@ -3333,13 +3411,7 @@
               <w:rPr>
                 <w:rFonts w:ascii="Times New Roman" w:hAnsi="Times New Roman" w:cs="Times New Roman"/>
               </w:rPr>
-              <w:t>NFR</w:t>
-            </w:r>
-            <w:r>
-              <w:rPr>
-                <w:rFonts w:ascii="Times New Roman" w:hAnsi="Times New Roman" w:cs="Times New Roman"/>
-              </w:rPr>
-              <w:t>5</w:t>
+              <w:t>NFR5</w:t>
             </w:r>
           </w:p>
         </w:tc>
@@ -3415,13 +3487,7 @@
               <w:rPr>
                 <w:rFonts w:ascii="Times New Roman" w:hAnsi="Times New Roman" w:cs="Times New Roman"/>
               </w:rPr>
-              <w:t>NFR</w:t>
-            </w:r>
-            <w:r>
-              <w:rPr>
-                <w:rFonts w:ascii="Times New Roman" w:hAnsi="Times New Roman" w:cs="Times New Roman"/>
-              </w:rPr>
-              <w:t>6</w:t>
+              <w:t>NFR6</w:t>
             </w:r>
           </w:p>
         </w:tc>
@@ -3497,13 +3563,7 @@
               <w:rPr>
                 <w:rFonts w:ascii="Times New Roman" w:hAnsi="Times New Roman" w:cs="Times New Roman"/>
               </w:rPr>
-              <w:t>NFR</w:t>
-            </w:r>
-            <w:r>
-              <w:rPr>
-                <w:rFonts w:ascii="Times New Roman" w:hAnsi="Times New Roman" w:cs="Times New Roman"/>
-              </w:rPr>
-              <w:t>7</w:t>
+              <w:t>NFR7</w:t>
             </w:r>
           </w:p>
         </w:tc>
@@ -3579,13 +3639,7 @@
               <w:rPr>
                 <w:rFonts w:ascii="Times New Roman" w:hAnsi="Times New Roman" w:cs="Times New Roman"/>
               </w:rPr>
-              <w:t>NFR</w:t>
-            </w:r>
-            <w:r>
-              <w:rPr>
-                <w:rFonts w:ascii="Times New Roman" w:hAnsi="Times New Roman" w:cs="Times New Roman"/>
-              </w:rPr>
-              <w:t>8</w:t>
+              <w:t>NFR8</w:t>
             </w:r>
           </w:p>
         </w:tc>
@@ -3661,13 +3715,7 @@
               <w:rPr>
                 <w:rFonts w:ascii="Times New Roman" w:hAnsi="Times New Roman" w:cs="Times New Roman"/>
               </w:rPr>
-              <w:t>NFR</w:t>
-            </w:r>
-            <w:r>
-              <w:rPr>
-                <w:rFonts w:ascii="Times New Roman" w:hAnsi="Times New Roman" w:cs="Times New Roman"/>
-              </w:rPr>
-              <w:t>9</w:t>
+              <w:t>NFR9</w:t>
             </w:r>
           </w:p>
         </w:tc>
@@ -3743,14 +3791,7 @@
               <w:rPr>
                 <w:rFonts w:ascii="Times New Roman" w:hAnsi="Times New Roman" w:cs="Times New Roman"/>
               </w:rPr>
-              <w:lastRenderedPageBreak/>
-              <w:t>NFR</w:t>
-            </w:r>
-            <w:r>
-              <w:rPr>
-                <w:rFonts w:ascii="Times New Roman" w:hAnsi="Times New Roman" w:cs="Times New Roman"/>
-              </w:rPr>
-              <w:t>10</w:t>
+              <w:t>NFR10</w:t>
             </w:r>
           </w:p>
         </w:tc>
@@ -3826,13 +3867,7 @@
               <w:rPr>
                 <w:rFonts w:ascii="Times New Roman" w:hAnsi="Times New Roman" w:cs="Times New Roman"/>
               </w:rPr>
-              <w:t>NFR</w:t>
-            </w:r>
-            <w:r>
-              <w:rPr>
-                <w:rFonts w:ascii="Times New Roman" w:hAnsi="Times New Roman" w:cs="Times New Roman"/>
-              </w:rPr>
-              <w:t>11</w:t>
+              <w:t>NFR11</w:t>
             </w:r>
           </w:p>
         </w:tc>
@@ -3926,13 +3961,8 @@
               <w:rPr>
                 <w:rFonts w:ascii="Times New Roman" w:hAnsi="Times New Roman" w:cs="Times New Roman"/>
               </w:rPr>
-              <w:t>NFR</w:t>
-            </w:r>
-            <w:r>
-              <w:rPr>
-                <w:rFonts w:ascii="Times New Roman" w:hAnsi="Times New Roman" w:cs="Times New Roman"/>
-              </w:rPr>
-              <w:t>12</w:t>
+              <w:lastRenderedPageBreak/>
+              <w:t>NFR12</w:t>
             </w:r>
           </w:p>
         </w:tc>

</xml_diff>

<commit_message>
Update requirement status column to done/CK
</commit_message>
<xml_diff>
--- a/docs/Requirement specification.docx
+++ b/docs/Requirement specification.docx
@@ -242,6 +242,12 @@
                 <w:rFonts w:ascii="Times New Roman" w:hAnsi="Times New Roman" w:cs="Times New Roman"/>
               </w:rPr>
               <w:t>Done</w:t>
+            </w:r>
+            <w:r>
+              <w:rPr>
+                <w:rFonts w:ascii="Times New Roman" w:hAnsi="Times New Roman" w:cs="Times New Roman"/>
+              </w:rPr>
+              <w:t>/CK</w:t>
             </w:r>
           </w:p>
         </w:tc>

</xml_diff>